<commit_message>
Gouvernement QCM : « Semaine de l'Indépendance » devient « Semaine de la Fête Nationale » (site, certificat, fichier unique, documents Word/PDF)
Co-Authored-By: Claude Fable 5.1 <noreply@anthropic.com>
Claude-Session: https://claude.ai/code/session_01JwfZPyGvot7MiYBzhQh2JB
</commit_message>
<xml_diff>
--- a/Quiz Histoire de la Guinee An 68 - Questionnaire et Corrige.docx
+++ b/Quiz Histoire de la Guinee An 68 - Questionnaire et Corrige.docx
@@ -14293,7 +14293,7 @@
                 <w:color w:val="7F838F"/>
                 <w:sz w:val="17"/>
               </w:rPr>
-              <w:t>Semaine de l'Indépendance An 68 : l'indépendance en héritage, la jeunesse en marche, Simandou 2040 en ligne de mire.</w:t>
+              <w:t>Semaine de la Fête Nationale An 68 : l'indépendance en héritage, la jeunesse en marche, Simandou 2040 en ligne de mire.</w:t>
             </w:r>
           </w:p>
         </w:tc>
@@ -14347,7 +14347,7 @@
         <w:color w:val="9AA3AE"/>
         <w:sz w:val="15"/>
       </w:rPr>
-      <w:t>Semaine de l'Indépendance · An 68 · République de Guinée · Quiz Histoire de la Guinée</w:t>
+      <w:t>Semaine de la Fête Nationale · An 68 · République de Guinée · Quiz Histoire de la Guinée</w:t>
     </w:r>
   </w:p>
 </w:ftr>

</xml_diff>